<commit_message>
fix: corregir navegación y añadir RegisterScreen con AlertDialog de Registro Exitoso
</commit_message>
<xml_diff>
--- a/ENTREGABLE II.docx
+++ b/ENTREGABLE II.docx
@@ -1569,6 +1569,1098 @@
         </w:rPr>
         <w:t>Reportes</w:t>
       </w:r>
+    </w:p>
+    <w:p>
+      <w:pPr>
+        <w:rPr>
+          <w:rFonts w:ascii="Arial" w:hAnsi="Arial" w:cs="Arial"/>
+          <w:b/>
+          <w:bCs/>
+        </w:rPr>
+      </w:pPr>
+      <w:r>
+        <w:rPr>
+          <w:rFonts w:ascii="Arial" w:hAnsi="Arial" w:cs="Arial"/>
+          <w:b/>
+          <w:bCs/>
+        </w:rPr>
+        <w:br w:type="page"/>
+      </w:r>
+    </w:p>
+    <w:p>
+      <w:pPr>
+        <w:spacing w:line="360" w:lineRule="auto"/>
+        <w:rPr>
+          <w:rFonts w:ascii="Arial" w:hAnsi="Arial" w:cs="Arial"/>
+          <w:b/>
+          <w:bCs/>
+        </w:rPr>
+      </w:pPr>
+      <w:r>
+        <w:rPr>
+          <w:rFonts w:ascii="Arial" w:hAnsi="Arial" w:cs="Arial"/>
+          <w:b/>
+          <w:bCs/>
+        </w:rPr>
+        <w:lastRenderedPageBreak/>
+        <w:t>ENTREGABLE III — ARQUITECTURA Y BASE TÉCNICA</w:t>
+      </w:r>
+    </w:p>
+    <w:p>
+      <w:pPr>
+        <w:spacing w:line="360" w:lineRule="auto"/>
+        <w:rPr>
+          <w:rFonts w:ascii="Arial" w:hAnsi="Arial" w:cs="Arial"/>
+        </w:rPr>
+      </w:pPr>
+      <w:r>
+        <w:rPr>
+          <w:rFonts w:ascii="Arial" w:hAnsi="Arial" w:cs="Arial"/>
+        </w:rPr>
+        <w:t xml:space="preserve">Para esta entrega se creó el proyecto Android de la aplicación Carito Café &amp; </w:t>
+      </w:r>
+      <w:proofErr w:type="spellStart"/>
+      <w:r>
+        <w:rPr>
+          <w:rFonts w:ascii="Arial" w:hAnsi="Arial" w:cs="Arial"/>
+        </w:rPr>
+        <w:t>Bakery</w:t>
+      </w:r>
+      <w:proofErr w:type="spellEnd"/>
+      <w:r>
+        <w:rPr>
+          <w:rFonts w:ascii="Arial" w:hAnsi="Arial" w:cs="Arial"/>
+        </w:rPr>
+        <w:t xml:space="preserve"> App, desarrollado en </w:t>
+      </w:r>
+      <w:proofErr w:type="spellStart"/>
+      <w:r>
+        <w:rPr>
+          <w:rFonts w:ascii="Arial" w:hAnsi="Arial" w:cs="Arial"/>
+        </w:rPr>
+        <w:t>Kotlin</w:t>
+      </w:r>
+      <w:proofErr w:type="spellEnd"/>
+      <w:r>
+        <w:rPr>
+          <w:rFonts w:ascii="Arial" w:hAnsi="Arial" w:cs="Arial"/>
+        </w:rPr>
+        <w:t>.</w:t>
+      </w:r>
+    </w:p>
+    <w:p>
+      <w:pPr>
+        <w:spacing w:line="360" w:lineRule="auto"/>
+        <w:rPr>
+          <w:rFonts w:ascii="Arial" w:hAnsi="Arial" w:cs="Arial"/>
+        </w:rPr>
+      </w:pPr>
+      <w:r>
+        <w:rPr>
+          <w:rFonts w:ascii="Arial" w:hAnsi="Arial" w:cs="Arial"/>
+        </w:rPr>
+        <w:t xml:space="preserve">La </w:t>
+      </w:r>
+      <w:proofErr w:type="gramStart"/>
+      <w:r>
+        <w:rPr>
+          <w:rFonts w:ascii="Arial" w:hAnsi="Arial" w:cs="Arial"/>
+        </w:rPr>
+        <w:t>app</w:t>
+      </w:r>
+      <w:proofErr w:type="gramEnd"/>
+      <w:r>
+        <w:rPr>
+          <w:rFonts w:ascii="Arial" w:hAnsi="Arial" w:cs="Arial"/>
+        </w:rPr>
+        <w:t xml:space="preserve"> está orientada a ayudar a una cafetería/panadería a controlar productos, pedidos y ventas, ya que el problema principal identificado es que actualmente los pedidos y ventas se manejan de forma manual. </w:t>
+      </w:r>
+    </w:p>
+    <w:p>
+      <w:pPr>
+        <w:spacing w:line="360" w:lineRule="auto"/>
+        <w:rPr>
+          <w:rFonts w:ascii="Arial" w:hAnsi="Arial" w:cs="Arial"/>
+        </w:rPr>
+      </w:pPr>
+      <w:r>
+        <w:rPr>
+          <w:rFonts w:ascii="Arial" w:hAnsi="Arial" w:cs="Arial"/>
+        </w:rPr>
+        <w:t xml:space="preserve">Nombre del proyecto: </w:t>
+      </w:r>
+      <w:r>
+        <w:rPr>
+          <w:rFonts w:ascii="Arial" w:hAnsi="Arial" w:cs="Arial"/>
+          <w:b/>
+          <w:bCs/>
+        </w:rPr>
+        <w:t xml:space="preserve">Carito Café &amp; </w:t>
+      </w:r>
+      <w:proofErr w:type="spellStart"/>
+      <w:r>
+        <w:rPr>
+          <w:rFonts w:ascii="Arial" w:hAnsi="Arial" w:cs="Arial"/>
+          <w:b/>
+          <w:bCs/>
+        </w:rPr>
+        <w:t>Bakery</w:t>
+      </w:r>
+      <w:proofErr w:type="spellEnd"/>
+      <w:r>
+        <w:rPr>
+          <w:rFonts w:ascii="Arial" w:hAnsi="Arial" w:cs="Arial"/>
+          <w:b/>
+          <w:bCs/>
+        </w:rPr>
+        <w:t xml:space="preserve"> App</w:t>
+      </w:r>
+      <w:r>
+        <w:rPr>
+          <w:rFonts w:ascii="Arial" w:hAnsi="Arial" w:cs="Arial"/>
+        </w:rPr>
+        <w:br/>
+        <w:t>Lenguaje:</w:t>
+      </w:r>
+      <w:r>
+        <w:rPr>
+          <w:rFonts w:ascii="Arial" w:hAnsi="Arial" w:cs="Arial"/>
+          <w:b/>
+          <w:bCs/>
+        </w:rPr>
+        <w:t xml:space="preserve"> </w:t>
+      </w:r>
+      <w:proofErr w:type="spellStart"/>
+      <w:r>
+        <w:rPr>
+          <w:rFonts w:ascii="Arial" w:hAnsi="Arial" w:cs="Arial"/>
+          <w:b/>
+          <w:bCs/>
+        </w:rPr>
+        <w:t>Kotlin</w:t>
+      </w:r>
+      <w:proofErr w:type="spellEnd"/>
+      <w:r>
+        <w:rPr>
+          <w:rFonts w:ascii="Arial" w:hAnsi="Arial" w:cs="Arial"/>
+        </w:rPr>
+        <w:br/>
+        <w:t xml:space="preserve">IDE: </w:t>
+      </w:r>
+      <w:r>
+        <w:rPr>
+          <w:rFonts w:ascii="Arial" w:hAnsi="Arial" w:cs="Arial"/>
+          <w:b/>
+          <w:bCs/>
+        </w:rPr>
+        <w:t>Android Studio</w:t>
+      </w:r>
+      <w:r>
+        <w:rPr>
+          <w:rFonts w:ascii="Arial" w:hAnsi="Arial" w:cs="Arial"/>
+        </w:rPr>
+        <w:br/>
+        <w:t xml:space="preserve">Tipo de </w:t>
+      </w:r>
+      <w:proofErr w:type="gramStart"/>
+      <w:r>
+        <w:rPr>
+          <w:rFonts w:ascii="Arial" w:hAnsi="Arial" w:cs="Arial"/>
+        </w:rPr>
+        <w:t>app</w:t>
+      </w:r>
+      <w:proofErr w:type="gramEnd"/>
+      <w:r>
+        <w:rPr>
+          <w:rFonts w:ascii="Arial" w:hAnsi="Arial" w:cs="Arial"/>
+        </w:rPr>
+        <w:t xml:space="preserve">: </w:t>
+      </w:r>
+      <w:r>
+        <w:rPr>
+          <w:rFonts w:ascii="Arial" w:hAnsi="Arial" w:cs="Arial"/>
+          <w:b/>
+          <w:bCs/>
+        </w:rPr>
+        <w:t>Aplicación móvil Android</w:t>
+      </w:r>
+      <w:r>
+        <w:rPr>
+          <w:rFonts w:ascii="Arial" w:hAnsi="Arial" w:cs="Arial"/>
+        </w:rPr>
+        <w:br/>
+        <w:t xml:space="preserve">Empresa: </w:t>
+      </w:r>
+      <w:r>
+        <w:rPr>
+          <w:rFonts w:ascii="Arial" w:hAnsi="Arial" w:cs="Arial"/>
+          <w:b/>
+          <w:bCs/>
+        </w:rPr>
+        <w:t xml:space="preserve">Carito Café &amp; </w:t>
+      </w:r>
+      <w:proofErr w:type="spellStart"/>
+      <w:r>
+        <w:rPr>
+          <w:rFonts w:ascii="Arial" w:hAnsi="Arial" w:cs="Arial"/>
+          <w:b/>
+          <w:bCs/>
+        </w:rPr>
+        <w:t>Bakery</w:t>
+      </w:r>
+      <w:proofErr w:type="spellEnd"/>
+    </w:p>
+    <w:p>
+      <w:pPr>
+        <w:spacing w:line="360" w:lineRule="auto"/>
+        <w:rPr>
+          <w:rFonts w:ascii="Arial" w:hAnsi="Arial" w:cs="Arial"/>
+          <w:b/>
+          <w:bCs/>
+        </w:rPr>
+      </w:pPr>
+      <w:r>
+        <w:rPr>
+          <w:rFonts w:ascii="Arial" w:hAnsi="Arial" w:cs="Arial"/>
+          <w:b/>
+          <w:bCs/>
+        </w:rPr>
+        <w:t>Navegación entre pantallas</w:t>
+      </w:r>
+    </w:p>
+    <w:p>
+      <w:pPr>
+        <w:spacing w:line="360" w:lineRule="auto"/>
+        <w:rPr>
+          <w:rFonts w:ascii="Arial" w:hAnsi="Arial" w:cs="Arial"/>
+        </w:rPr>
+      </w:pPr>
+      <w:r>
+        <w:rPr>
+          <w:rFonts w:ascii="Arial" w:hAnsi="Arial" w:cs="Arial"/>
+        </w:rPr>
+        <w:t>La aplicación tendrá una navegación básica entre las pantallas principales del sistema.</w:t>
+      </w:r>
+    </w:p>
+    <w:p>
+      <w:pPr>
+        <w:spacing w:line="360" w:lineRule="auto"/>
+        <w:rPr>
+          <w:rFonts w:ascii="Arial" w:hAnsi="Arial" w:cs="Arial"/>
+        </w:rPr>
+      </w:pPr>
+      <w:r>
+        <w:rPr>
+          <w:rFonts w:ascii="Arial" w:hAnsi="Arial" w:cs="Arial"/>
+        </w:rPr>
+        <w:t>Las pantallas creadas o planificadas son:</w:t>
+      </w:r>
+    </w:p>
+    <w:p>
+      <w:pPr>
+        <w:numPr>
+          <w:ilvl w:val="0"/>
+          <w:numId w:val="12"/>
+        </w:numPr>
+        <w:spacing w:line="360" w:lineRule="auto"/>
+        <w:rPr>
+          <w:rFonts w:ascii="Arial" w:hAnsi="Arial" w:cs="Arial"/>
+        </w:rPr>
+      </w:pPr>
+      <w:r>
+        <w:rPr>
+          <w:rFonts w:ascii="Arial" w:hAnsi="Arial" w:cs="Arial"/>
+        </w:rPr>
+        <w:t xml:space="preserve">Login </w:t>
+      </w:r>
+    </w:p>
+    <w:p>
+      <w:pPr>
+        <w:numPr>
+          <w:ilvl w:val="0"/>
+          <w:numId w:val="12"/>
+        </w:numPr>
+        <w:spacing w:line="360" w:lineRule="auto"/>
+        <w:rPr>
+          <w:rFonts w:ascii="Arial" w:hAnsi="Arial" w:cs="Arial"/>
+        </w:rPr>
+      </w:pPr>
+      <w:r>
+        <w:rPr>
+          <w:rFonts w:ascii="Arial" w:hAnsi="Arial" w:cs="Arial"/>
+        </w:rPr>
+        <w:t xml:space="preserve">Pantalla principal </w:t>
+      </w:r>
+    </w:p>
+    <w:p>
+      <w:pPr>
+        <w:numPr>
+          <w:ilvl w:val="0"/>
+          <w:numId w:val="12"/>
+        </w:numPr>
+        <w:spacing w:line="360" w:lineRule="auto"/>
+        <w:rPr>
+          <w:rFonts w:ascii="Arial" w:hAnsi="Arial" w:cs="Arial"/>
+        </w:rPr>
+      </w:pPr>
+      <w:r>
+        <w:rPr>
+          <w:rFonts w:ascii="Arial" w:hAnsi="Arial" w:cs="Arial"/>
+        </w:rPr>
+        <w:t xml:space="preserve">Lista de productos </w:t>
+      </w:r>
+    </w:p>
+    <w:p>
+      <w:pPr>
+        <w:numPr>
+          <w:ilvl w:val="0"/>
+          <w:numId w:val="12"/>
+        </w:numPr>
+        <w:spacing w:line="360" w:lineRule="auto"/>
+        <w:rPr>
+          <w:rFonts w:ascii="Arial" w:hAnsi="Arial" w:cs="Arial"/>
+        </w:rPr>
+      </w:pPr>
+      <w:r>
+        <w:rPr>
+          <w:rFonts w:ascii="Arial" w:hAnsi="Arial" w:cs="Arial"/>
+        </w:rPr>
+        <w:t xml:space="preserve">Crear producto </w:t>
+      </w:r>
+    </w:p>
+    <w:p>
+      <w:pPr>
+        <w:numPr>
+          <w:ilvl w:val="0"/>
+          <w:numId w:val="12"/>
+        </w:numPr>
+        <w:spacing w:line="360" w:lineRule="auto"/>
+        <w:rPr>
+          <w:rFonts w:ascii="Arial" w:hAnsi="Arial" w:cs="Arial"/>
+        </w:rPr>
+      </w:pPr>
+      <w:r>
+        <w:rPr>
+          <w:rFonts w:ascii="Arial" w:hAnsi="Arial" w:cs="Arial"/>
+        </w:rPr>
+        <w:t xml:space="preserve">Nueva orden </w:t>
+      </w:r>
+    </w:p>
+    <w:p>
+      <w:pPr>
+        <w:numPr>
+          <w:ilvl w:val="0"/>
+          <w:numId w:val="12"/>
+        </w:numPr>
+        <w:spacing w:line="360" w:lineRule="auto"/>
+        <w:rPr>
+          <w:rFonts w:ascii="Arial" w:hAnsi="Arial" w:cs="Arial"/>
+        </w:rPr>
+      </w:pPr>
+      <w:r>
+        <w:rPr>
+          <w:rFonts w:ascii="Arial" w:hAnsi="Arial" w:cs="Arial"/>
+        </w:rPr>
+        <w:t xml:space="preserve">Detalle de orden </w:t>
+      </w:r>
+    </w:p>
+    <w:p>
+      <w:pPr>
+        <w:numPr>
+          <w:ilvl w:val="0"/>
+          <w:numId w:val="12"/>
+        </w:numPr>
+        <w:spacing w:line="360" w:lineRule="auto"/>
+        <w:rPr>
+          <w:rFonts w:ascii="Arial" w:hAnsi="Arial" w:cs="Arial"/>
+        </w:rPr>
+      </w:pPr>
+      <w:r>
+        <w:rPr>
+          <w:rFonts w:ascii="Arial" w:hAnsi="Arial" w:cs="Arial"/>
+        </w:rPr>
+        <w:t>Reportes</w:t>
+      </w:r>
+    </w:p>
+    <w:p>
+      <w:pPr>
+        <w:rPr>
+          <w:rFonts w:ascii="Arial" w:hAnsi="Arial" w:cs="Arial"/>
+          <w:b/>
+          <w:bCs/>
+        </w:rPr>
+      </w:pPr>
+      <w:r>
+        <w:rPr>
+          <w:rFonts w:ascii="Arial" w:hAnsi="Arial" w:cs="Arial"/>
+          <w:b/>
+          <w:bCs/>
+        </w:rPr>
+        <w:br w:type="page"/>
+      </w:r>
+    </w:p>
+    <w:p>
+      <w:pPr>
+        <w:spacing w:line="360" w:lineRule="auto"/>
+        <w:jc w:val="center"/>
+        <w:rPr>
+          <w:rFonts w:ascii="Arial" w:hAnsi="Arial" w:cs="Arial"/>
+          <w:b/>
+          <w:bCs/>
+        </w:rPr>
+      </w:pPr>
+      <w:r>
+        <w:rPr>
+          <w:rFonts w:ascii="Arial" w:hAnsi="Arial" w:cs="Arial"/>
+          <w:b/>
+          <w:bCs/>
+        </w:rPr>
+        <w:lastRenderedPageBreak/>
+        <w:t>Flujo de navegación</w:t>
+      </w:r>
+    </w:p>
+    <w:p>
+      <w:pPr>
+        <w:spacing w:line="360" w:lineRule="auto"/>
+        <w:rPr>
+          <w:rFonts w:ascii="Arial" w:hAnsi="Arial" w:cs="Arial"/>
+          <w:b/>
+          <w:bCs/>
+        </w:rPr>
+      </w:pPr>
+    </w:p>
+    <w:p>
+      <w:pPr>
+        <w:spacing w:line="360" w:lineRule="auto"/>
+        <w:rPr>
+          <w:rFonts w:ascii="Arial" w:hAnsi="Arial" w:cs="Arial"/>
+          <w:b/>
+          <w:bCs/>
+        </w:rPr>
+      </w:pPr>
+      <w:r>
+        <w:rPr>
+          <w:rFonts w:ascii="Arial" w:hAnsi="Arial" w:cs="Arial"/>
+          <w:b/>
+          <w:bCs/>
+        </w:rPr>
+        <w:t>Login</w:t>
+      </w:r>
+    </w:p>
+    <w:p>
+      <w:pPr>
+        <w:spacing w:line="360" w:lineRule="auto"/>
+        <w:rPr>
+          <w:rFonts w:ascii="Arial" w:hAnsi="Arial" w:cs="Arial"/>
+          <w:b/>
+          <w:bCs/>
+        </w:rPr>
+      </w:pPr>
+      <w:r>
+        <w:rPr>
+          <w:rFonts w:ascii="Arial" w:hAnsi="Arial" w:cs="Arial"/>
+          <w:b/>
+          <w:bCs/>
+        </w:rPr>
+        <w:t>|</w:t>
+      </w:r>
+    </w:p>
+    <w:p>
+      <w:pPr>
+        <w:spacing w:line="360" w:lineRule="auto"/>
+        <w:rPr>
+          <w:rFonts w:ascii="Arial" w:hAnsi="Arial" w:cs="Arial"/>
+          <w:b/>
+          <w:bCs/>
+        </w:rPr>
+      </w:pPr>
+      <w:r>
+        <w:rPr>
+          <w:rFonts w:ascii="Arial" w:hAnsi="Arial" w:cs="Arial"/>
+          <w:b/>
+          <w:bCs/>
+        </w:rPr>
+        <w:t>Pantalla principal</w:t>
+      </w:r>
+    </w:p>
+    <w:p>
+      <w:pPr>
+        <w:spacing w:line="360" w:lineRule="auto"/>
+        <w:rPr>
+          <w:rFonts w:ascii="Arial" w:hAnsi="Arial" w:cs="Arial"/>
+          <w:b/>
+          <w:bCs/>
+        </w:rPr>
+      </w:pPr>
+      <w:r>
+        <w:rPr>
+          <w:rFonts w:ascii="Arial" w:hAnsi="Arial" w:cs="Arial"/>
+          <w:b/>
+          <w:bCs/>
+        </w:rPr>
+        <w:t>|</w:t>
+      </w:r>
+    </w:p>
+    <w:p>
+      <w:pPr>
+        <w:spacing w:line="360" w:lineRule="auto"/>
+        <w:rPr>
+          <w:rFonts w:ascii="Arial" w:hAnsi="Arial" w:cs="Arial"/>
+          <w:b/>
+          <w:bCs/>
+        </w:rPr>
+      </w:pPr>
+      <w:r>
+        <w:rPr>
+          <w:rFonts w:ascii="Arial" w:hAnsi="Arial" w:cs="Arial"/>
+          <w:b/>
+          <w:bCs/>
+        </w:rPr>
+        <w:t>├── Productos</w:t>
+      </w:r>
+    </w:p>
+    <w:p>
+      <w:pPr>
+        <w:spacing w:line="360" w:lineRule="auto"/>
+        <w:rPr>
+          <w:rFonts w:ascii="Arial" w:hAnsi="Arial" w:cs="Arial"/>
+          <w:b/>
+          <w:bCs/>
+        </w:rPr>
+      </w:pPr>
+      <w:r>
+        <w:rPr>
+          <w:rFonts w:ascii="Arial" w:hAnsi="Arial" w:cs="Arial"/>
+          <w:b/>
+          <w:bCs/>
+        </w:rPr>
+        <w:t>│    └── Crear producto</w:t>
+      </w:r>
+    </w:p>
+    <w:p>
+      <w:pPr>
+        <w:spacing w:line="360" w:lineRule="auto"/>
+        <w:rPr>
+          <w:rFonts w:ascii="Arial" w:hAnsi="Arial" w:cs="Arial"/>
+          <w:b/>
+          <w:bCs/>
+        </w:rPr>
+      </w:pPr>
+      <w:r>
+        <w:rPr>
+          <w:rFonts w:ascii="Arial" w:hAnsi="Arial" w:cs="Arial"/>
+          <w:b/>
+          <w:bCs/>
+        </w:rPr>
+        <w:t>│</w:t>
+      </w:r>
+    </w:p>
+    <w:p>
+      <w:pPr>
+        <w:spacing w:line="360" w:lineRule="auto"/>
+        <w:rPr>
+          <w:rFonts w:ascii="Arial" w:hAnsi="Arial" w:cs="Arial"/>
+          <w:b/>
+          <w:bCs/>
+        </w:rPr>
+      </w:pPr>
+      <w:r>
+        <w:rPr>
+          <w:rFonts w:ascii="Arial" w:hAnsi="Arial" w:cs="Arial"/>
+          <w:b/>
+          <w:bCs/>
+        </w:rPr>
+        <w:t>├── Órdenes</w:t>
+      </w:r>
+    </w:p>
+    <w:p>
+      <w:pPr>
+        <w:spacing w:line="360" w:lineRule="auto"/>
+        <w:rPr>
+          <w:rFonts w:ascii="Arial" w:hAnsi="Arial" w:cs="Arial"/>
+          <w:b/>
+          <w:bCs/>
+        </w:rPr>
+      </w:pPr>
+      <w:r>
+        <w:rPr>
+          <w:rFonts w:ascii="Arial" w:hAnsi="Arial" w:cs="Arial"/>
+          <w:b/>
+          <w:bCs/>
+        </w:rPr>
+        <w:t>│    └── Nueva orden / Detalle de orden</w:t>
+      </w:r>
+    </w:p>
+    <w:p>
+      <w:pPr>
+        <w:spacing w:line="360" w:lineRule="auto"/>
+        <w:rPr>
+          <w:rFonts w:ascii="Arial" w:hAnsi="Arial" w:cs="Arial"/>
+          <w:b/>
+          <w:bCs/>
+        </w:rPr>
+      </w:pPr>
+      <w:r>
+        <w:rPr>
+          <w:rFonts w:ascii="Arial" w:hAnsi="Arial" w:cs="Arial"/>
+          <w:b/>
+          <w:bCs/>
+        </w:rPr>
+        <w:t>│</w:t>
+      </w:r>
+    </w:p>
+    <w:p>
+      <w:pPr>
+        <w:spacing w:line="360" w:lineRule="auto"/>
+        <w:rPr>
+          <w:rFonts w:ascii="Arial" w:hAnsi="Arial" w:cs="Arial"/>
+          <w:b/>
+          <w:bCs/>
+        </w:rPr>
+      </w:pPr>
+      <w:r>
+        <w:rPr>
+          <w:rFonts w:ascii="Arial" w:hAnsi="Arial" w:cs="Arial"/>
+          <w:b/>
+          <w:bCs/>
+        </w:rPr>
+        <w:t>└── Reportes</w:t>
+      </w:r>
+    </w:p>
+    <w:p>
+      <w:pPr>
+        <w:spacing w:line="360" w:lineRule="auto"/>
+        <w:rPr>
+          <w:rFonts w:ascii="Arial" w:hAnsi="Arial" w:cs="Arial"/>
+          <w:b/>
+          <w:bCs/>
+        </w:rPr>
+      </w:pPr>
+    </w:p>
+    <w:p>
+      <w:pPr>
+        <w:spacing w:line="360" w:lineRule="auto"/>
+        <w:rPr>
+          <w:rFonts w:ascii="Arial" w:hAnsi="Arial" w:cs="Arial"/>
+          <w:b/>
+          <w:bCs/>
+        </w:rPr>
+      </w:pPr>
+    </w:p>
+    <w:p>
+      <w:pPr>
+        <w:spacing w:line="360" w:lineRule="auto"/>
+        <w:rPr>
+          <w:rFonts w:ascii="Arial" w:hAnsi="Arial" w:cs="Arial"/>
+          <w:b/>
+          <w:bCs/>
+        </w:rPr>
+      </w:pPr>
+    </w:p>
+    <w:p>
+      <w:pPr>
+        <w:spacing w:line="360" w:lineRule="auto"/>
+        <w:rPr>
+          <w:rFonts w:ascii="Arial" w:hAnsi="Arial" w:cs="Arial"/>
+          <w:b/>
+          <w:bCs/>
+        </w:rPr>
+      </w:pPr>
+    </w:p>
+    <w:p>
+      <w:pPr>
+        <w:spacing w:line="360" w:lineRule="auto"/>
+        <w:rPr>
+          <w:rFonts w:ascii="Arial" w:hAnsi="Arial" w:cs="Arial"/>
+          <w:b/>
+          <w:bCs/>
+        </w:rPr>
+      </w:pPr>
+    </w:p>
+    <w:p>
+      <w:pPr>
+        <w:spacing w:line="360" w:lineRule="auto"/>
+        <w:rPr>
+          <w:rFonts w:ascii="Arial" w:hAnsi="Arial" w:cs="Arial"/>
+          <w:b/>
+          <w:bCs/>
+        </w:rPr>
+      </w:pPr>
+    </w:p>
+    <w:p>
+      <w:pPr>
+        <w:spacing w:line="360" w:lineRule="auto"/>
+        <w:rPr>
+          <w:rFonts w:ascii="Arial" w:hAnsi="Arial" w:cs="Arial"/>
+          <w:b/>
+          <w:bCs/>
+        </w:rPr>
+      </w:pPr>
+    </w:p>
+    <w:p>
+      <w:pPr>
+        <w:spacing w:line="360" w:lineRule="auto"/>
+        <w:rPr>
+          <w:rFonts w:ascii="Arial" w:hAnsi="Arial" w:cs="Arial"/>
+          <w:b/>
+          <w:bCs/>
+        </w:rPr>
+      </w:pPr>
+    </w:p>
+    <w:p>
+      <w:pPr>
+        <w:spacing w:line="360" w:lineRule="auto"/>
+        <w:rPr>
+          <w:rFonts w:ascii="Arial" w:hAnsi="Arial" w:cs="Arial"/>
+          <w:b/>
+          <w:bCs/>
+        </w:rPr>
+      </w:pPr>
+    </w:p>
+    <w:p>
+      <w:pPr>
+        <w:spacing w:line="360" w:lineRule="auto"/>
+        <w:rPr>
+          <w:rFonts w:ascii="Arial" w:hAnsi="Arial" w:cs="Arial"/>
+          <w:b/>
+          <w:bCs/>
+        </w:rPr>
+      </w:pPr>
+    </w:p>
+    <w:p>
+      <w:pPr>
+        <w:spacing w:line="360" w:lineRule="auto"/>
+        <w:rPr>
+          <w:rFonts w:ascii="Arial" w:hAnsi="Arial" w:cs="Arial"/>
+        </w:rPr>
+      </w:pPr>
+      <w:r>
+        <w:rPr>
+          <w:rFonts w:ascii="Arial" w:hAnsi="Arial" w:cs="Arial"/>
+          <w:b/>
+          <w:bCs/>
+        </w:rPr>
+        <w:lastRenderedPageBreak/>
+        <w:t>Estructura de paquetes</w:t>
+      </w:r>
+    </w:p>
+    <w:p>
+      <w:pPr>
+        <w:spacing w:line="360" w:lineRule="auto"/>
+        <w:rPr>
+          <w:rFonts w:ascii="Arial" w:hAnsi="Arial" w:cs="Arial"/>
+        </w:rPr>
+      </w:pPr>
+      <w:r>
+        <w:rPr>
+          <w:rFonts w:ascii="Arial" w:hAnsi="Arial" w:cs="Arial"/>
+        </w:rPr>
+        <w:t>La estructura inicial del proyecto se organizará de la siguiente manera:</w:t>
+      </w:r>
+    </w:p>
+    <w:p>
+      <w:pPr>
+        <w:spacing w:line="360" w:lineRule="auto"/>
+        <w:jc w:val="center"/>
+        <w:rPr>
+          <w:rFonts w:ascii="Arial" w:hAnsi="Arial" w:cs="Arial"/>
+          <w:b/>
+          <w:bCs/>
+        </w:rPr>
+      </w:pPr>
+      <w:r>
+        <w:rPr>
+          <w:rFonts w:ascii="Arial" w:hAnsi="Arial" w:cs="Arial"/>
+          <w:b/>
+          <w:bCs/>
+        </w:rPr>
+        <w:drawing>
+          <wp:inline distT="0" distB="0" distL="0" distR="0" wp14:anchorId="281F1697" wp14:editId="4BB27207">
+            <wp:extent cx="2629267" cy="3848637"/>
+            <wp:effectExtent l="0" t="0" r="0" b="0"/>
+            <wp:docPr id="1000865275" name="Imagen 1"/>
+            <wp:cNvGraphicFramePr>
+              <a:graphicFrameLocks xmlns:a="http://schemas.openxmlformats.org/drawingml/2006/main" noChangeAspect="1"/>
+            </wp:cNvGraphicFramePr>
+            <a:graphic xmlns:a="http://schemas.openxmlformats.org/drawingml/2006/main">
+              <a:graphicData uri="http://schemas.openxmlformats.org/drawingml/2006/picture">
+                <pic:pic xmlns:pic="http://schemas.openxmlformats.org/drawingml/2006/picture">
+                  <pic:nvPicPr>
+                    <pic:cNvPr id="1000865275" name=""/>
+                    <pic:cNvPicPr/>
+                  </pic:nvPicPr>
+                  <pic:blipFill>
+                    <a:blip r:embed="rId5"/>
+                    <a:stretch>
+                      <a:fillRect/>
+                    </a:stretch>
+                  </pic:blipFill>
+                  <pic:spPr>
+                    <a:xfrm>
+                      <a:off x="0" y="0"/>
+                      <a:ext cx="2629267" cy="3848637"/>
+                    </a:xfrm>
+                    <a:prstGeom prst="rect">
+                      <a:avLst/>
+                    </a:prstGeom>
+                  </pic:spPr>
+                </pic:pic>
+              </a:graphicData>
+            </a:graphic>
+          </wp:inline>
+        </w:drawing>
+      </w:r>
+    </w:p>
+    <w:p>
+      <w:pPr>
+        <w:spacing w:line="360" w:lineRule="auto"/>
+        <w:jc w:val="center"/>
+        <w:rPr>
+          <w:rFonts w:ascii="Arial" w:hAnsi="Arial" w:cs="Arial"/>
+          <w:b/>
+          <w:bCs/>
+        </w:rPr>
+      </w:pPr>
+    </w:p>
+    <w:p>
+      <w:pPr>
+        <w:spacing w:line="360" w:lineRule="auto"/>
+        <w:jc w:val="center"/>
+        <w:rPr>
+          <w:rFonts w:ascii="Arial" w:hAnsi="Arial" w:cs="Arial"/>
+          <w:b/>
+          <w:bCs/>
+        </w:rPr>
+      </w:pPr>
+      <w:r>
+        <w:rPr>
+          <w:rFonts w:ascii="Arial" w:hAnsi="Arial" w:cs="Arial"/>
+          <w:b/>
+          <w:bCs/>
+        </w:rPr>
+        <w:t>Modelos principales</w:t>
+      </w:r>
+    </w:p>
+    <w:p>
+      <w:pPr>
+        <w:spacing w:line="360" w:lineRule="auto"/>
+        <w:jc w:val="center"/>
+        <w:rPr>
+          <w:rFonts w:ascii="Arial" w:hAnsi="Arial" w:cs="Arial"/>
+          <w:b/>
+          <w:bCs/>
+        </w:rPr>
+      </w:pPr>
+      <w:proofErr w:type="spellStart"/>
+      <w:r>
+        <w:rPr>
+          <w:rFonts w:ascii="Arial" w:hAnsi="Arial" w:cs="Arial"/>
+          <w:b/>
+          <w:bCs/>
+        </w:rPr>
+        <w:t>Product.kt</w:t>
+      </w:r>
+      <w:proofErr w:type="spellEnd"/>
+    </w:p>
+    <w:p>
+      <w:pPr>
+        <w:spacing w:line="360" w:lineRule="auto"/>
+        <w:jc w:val="center"/>
+        <w:rPr>
+          <w:rFonts w:ascii="Arial" w:hAnsi="Arial" w:cs="Arial"/>
+          <w:b/>
+          <w:bCs/>
+        </w:rPr>
+      </w:pPr>
+      <w:r>
+        <w:rPr>
+          <w:rFonts w:ascii="Arial" w:hAnsi="Arial" w:cs="Arial"/>
+          <w:b/>
+          <w:bCs/>
+        </w:rPr>
+        <w:drawing>
+          <wp:inline distT="0" distB="0" distL="0" distR="0" wp14:anchorId="59095A41" wp14:editId="20132C8C">
+            <wp:extent cx="5612130" cy="2303780"/>
+            <wp:effectExtent l="0" t="0" r="7620" b="1270"/>
+            <wp:docPr id="649699659" name="Imagen 1"/>
+            <wp:cNvGraphicFramePr>
+              <a:graphicFrameLocks xmlns:a="http://schemas.openxmlformats.org/drawingml/2006/main" noChangeAspect="1"/>
+            </wp:cNvGraphicFramePr>
+            <a:graphic xmlns:a="http://schemas.openxmlformats.org/drawingml/2006/main">
+              <a:graphicData uri="http://schemas.openxmlformats.org/drawingml/2006/picture">
+                <pic:pic xmlns:pic="http://schemas.openxmlformats.org/drawingml/2006/picture">
+                  <pic:nvPicPr>
+                    <pic:cNvPr id="649699659" name=""/>
+                    <pic:cNvPicPr/>
+                  </pic:nvPicPr>
+                  <pic:blipFill>
+                    <a:blip r:embed="rId6"/>
+                    <a:stretch>
+                      <a:fillRect/>
+                    </a:stretch>
+                  </pic:blipFill>
+                  <pic:spPr>
+                    <a:xfrm>
+                      <a:off x="0" y="0"/>
+                      <a:ext cx="5612130" cy="2303780"/>
+                    </a:xfrm>
+                    <a:prstGeom prst="rect">
+                      <a:avLst/>
+                    </a:prstGeom>
+                  </pic:spPr>
+                </pic:pic>
+              </a:graphicData>
+            </a:graphic>
+          </wp:inline>
+        </w:drawing>
+      </w:r>
+    </w:p>
+    <w:p>
+      <w:pPr>
+        <w:spacing w:line="360" w:lineRule="auto"/>
+        <w:jc w:val="center"/>
+        <w:rPr>
+          <w:rFonts w:ascii="Arial" w:hAnsi="Arial" w:cs="Arial"/>
+          <w:b/>
+          <w:bCs/>
+        </w:rPr>
+      </w:pPr>
+      <w:proofErr w:type="spellStart"/>
+      <w:r>
+        <w:rPr>
+          <w:rFonts w:ascii="Arial" w:hAnsi="Arial" w:cs="Arial"/>
+          <w:b/>
+          <w:bCs/>
+        </w:rPr>
+        <w:lastRenderedPageBreak/>
+        <w:t>Order.kt</w:t>
+      </w:r>
+      <w:proofErr w:type="spellEnd"/>
+    </w:p>
+    <w:p>
+      <w:pPr>
+        <w:spacing w:line="360" w:lineRule="auto"/>
+        <w:jc w:val="center"/>
+        <w:rPr>
+          <w:rFonts w:ascii="Arial" w:hAnsi="Arial" w:cs="Arial"/>
+          <w:b/>
+          <w:bCs/>
+        </w:rPr>
+      </w:pPr>
+      <w:r>
+        <w:rPr>
+          <w:rFonts w:ascii="Arial" w:hAnsi="Arial" w:cs="Arial"/>
+          <w:b/>
+          <w:bCs/>
+        </w:rPr>
+        <w:drawing>
+          <wp:inline distT="0" distB="0" distL="0" distR="0" wp14:anchorId="756E9833" wp14:editId="2ED1E379">
+            <wp:extent cx="5477639" cy="2857899"/>
+            <wp:effectExtent l="0" t="0" r="0" b="0"/>
+            <wp:docPr id="30906818" name="Imagen 1"/>
+            <wp:cNvGraphicFramePr>
+              <a:graphicFrameLocks xmlns:a="http://schemas.openxmlformats.org/drawingml/2006/main" noChangeAspect="1"/>
+            </wp:cNvGraphicFramePr>
+            <a:graphic xmlns:a="http://schemas.openxmlformats.org/drawingml/2006/main">
+              <a:graphicData uri="http://schemas.openxmlformats.org/drawingml/2006/picture">
+                <pic:pic xmlns:pic="http://schemas.openxmlformats.org/drawingml/2006/picture">
+                  <pic:nvPicPr>
+                    <pic:cNvPr id="30906818" name=""/>
+                    <pic:cNvPicPr/>
+                  </pic:nvPicPr>
+                  <pic:blipFill>
+                    <a:blip r:embed="rId7"/>
+                    <a:stretch>
+                      <a:fillRect/>
+                    </a:stretch>
+                  </pic:blipFill>
+                  <pic:spPr>
+                    <a:xfrm>
+                      <a:off x="0" y="0"/>
+                      <a:ext cx="5477639" cy="2857899"/>
+                    </a:xfrm>
+                    <a:prstGeom prst="rect">
+                      <a:avLst/>
+                    </a:prstGeom>
+                  </pic:spPr>
+                </pic:pic>
+              </a:graphicData>
+            </a:graphic>
+          </wp:inline>
+        </w:drawing>
+      </w:r>
+    </w:p>
+    <w:p>
+      <w:pPr>
+        <w:spacing w:line="360" w:lineRule="auto"/>
+        <w:rPr>
+          <w:rFonts w:ascii="Arial" w:hAnsi="Arial" w:cs="Arial"/>
+          <w:b/>
+          <w:bCs/>
+        </w:rPr>
+      </w:pPr>
+    </w:p>
+    <w:p>
+      <w:pPr>
+        <w:spacing w:line="360" w:lineRule="auto"/>
+        <w:rPr>
+          <w:rFonts w:ascii="Arial" w:hAnsi="Arial" w:cs="Arial"/>
+          <w:b/>
+          <w:bCs/>
+        </w:rPr>
+      </w:pPr>
+      <w:r>
+        <w:rPr>
+          <w:rFonts w:ascii="Arial" w:hAnsi="Arial" w:cs="Arial"/>
+          <w:b/>
+          <w:bCs/>
+        </w:rPr>
+        <w:t>Repositorio Git</w:t>
+      </w:r>
+    </w:p>
+    <w:p>
+      <w:pPr>
+        <w:spacing w:line="360" w:lineRule="auto"/>
+        <w:rPr>
+          <w:rFonts w:ascii="Arial" w:hAnsi="Arial" w:cs="Arial"/>
+        </w:rPr>
+      </w:pPr>
+      <w:r>
+        <w:rPr>
+          <w:rFonts w:ascii="Arial" w:hAnsi="Arial" w:cs="Arial"/>
+        </w:rPr>
+        <w:t>El proyecto será subido a un repositorio en GitHub para llevar control de versiones.</w:t>
+      </w:r>
+    </w:p>
+    <w:p>
+      <w:pPr>
+        <w:spacing w:line="360" w:lineRule="auto"/>
+        <w:jc w:val="center"/>
+        <w:rPr>
+          <w:rFonts w:ascii="Arial" w:hAnsi="Arial" w:cs="Arial"/>
+          <w:b/>
+          <w:bCs/>
+        </w:rPr>
+      </w:pPr>
+      <w:r>
+        <w:rPr>
+          <w:rFonts w:ascii="Arial" w:hAnsi="Arial" w:cs="Arial"/>
+          <w:b/>
+          <w:bCs/>
+        </w:rPr>
+        <w:t>https://github.com/khoopper/CaritoCafe</w:t>
+      </w:r>
+    </w:p>
+    <w:p>
+      <w:pPr>
+        <w:spacing w:line="360" w:lineRule="auto"/>
+        <w:jc w:val="center"/>
+        <w:rPr>
+          <w:rFonts w:ascii="Arial" w:hAnsi="Arial" w:cs="Arial"/>
+          <w:b/>
+          <w:bCs/>
+        </w:rPr>
+      </w:pPr>
     </w:p>
     <w:sectPr>
       <w:pgSz w:w="12240" w:h="15840"/>
@@ -2437,6 +3529,119 @@
     </w:lvl>
   </w:abstractNum>
   <w:abstractNum w:abstractNumId="6" w15:restartNumberingAfterBreak="0">
+    <w:nsid w:val="4DC845E8"/>
+    <w:multiLevelType w:val="multilevel"/>
+    <w:tmpl w:val="49863006"/>
+    <w:lvl w:ilvl="0">
+      <w:start w:val="1"/>
+      <w:numFmt w:val="decimal"/>
+      <w:lvlText w:val="%1."/>
+      <w:lvlJc w:val="left"/>
+      <w:pPr>
+        <w:tabs>
+          <w:tab w:val="num" w:pos="720"/>
+        </w:tabs>
+        <w:ind w:left="720" w:hanging="360"/>
+      </w:pPr>
+    </w:lvl>
+    <w:lvl w:ilvl="1" w:tentative="1">
+      <w:start w:val="1"/>
+      <w:numFmt w:val="decimal"/>
+      <w:lvlText w:val="%2."/>
+      <w:lvlJc w:val="left"/>
+      <w:pPr>
+        <w:tabs>
+          <w:tab w:val="num" w:pos="1440"/>
+        </w:tabs>
+        <w:ind w:left="1440" w:hanging="360"/>
+      </w:pPr>
+    </w:lvl>
+    <w:lvl w:ilvl="2" w:tentative="1">
+      <w:start w:val="1"/>
+      <w:numFmt w:val="decimal"/>
+      <w:lvlText w:val="%3."/>
+      <w:lvlJc w:val="left"/>
+      <w:pPr>
+        <w:tabs>
+          <w:tab w:val="num" w:pos="2160"/>
+        </w:tabs>
+        <w:ind w:left="2160" w:hanging="360"/>
+      </w:pPr>
+    </w:lvl>
+    <w:lvl w:ilvl="3" w:tentative="1">
+      <w:start w:val="1"/>
+      <w:numFmt w:val="decimal"/>
+      <w:lvlText w:val="%4."/>
+      <w:lvlJc w:val="left"/>
+      <w:pPr>
+        <w:tabs>
+          <w:tab w:val="num" w:pos="2880"/>
+        </w:tabs>
+        <w:ind w:left="2880" w:hanging="360"/>
+      </w:pPr>
+    </w:lvl>
+    <w:lvl w:ilvl="4" w:tentative="1">
+      <w:start w:val="1"/>
+      <w:numFmt w:val="decimal"/>
+      <w:lvlText w:val="%5."/>
+      <w:lvlJc w:val="left"/>
+      <w:pPr>
+        <w:tabs>
+          <w:tab w:val="num" w:pos="3600"/>
+        </w:tabs>
+        <w:ind w:left="3600" w:hanging="360"/>
+      </w:pPr>
+    </w:lvl>
+    <w:lvl w:ilvl="5" w:tentative="1">
+      <w:start w:val="1"/>
+      <w:numFmt w:val="decimal"/>
+      <w:lvlText w:val="%6."/>
+      <w:lvlJc w:val="left"/>
+      <w:pPr>
+        <w:tabs>
+          <w:tab w:val="num" w:pos="4320"/>
+        </w:tabs>
+        <w:ind w:left="4320" w:hanging="360"/>
+      </w:pPr>
+    </w:lvl>
+    <w:lvl w:ilvl="6" w:tentative="1">
+      <w:start w:val="1"/>
+      <w:numFmt w:val="decimal"/>
+      <w:lvlText w:val="%7."/>
+      <w:lvlJc w:val="left"/>
+      <w:pPr>
+        <w:tabs>
+          <w:tab w:val="num" w:pos="5040"/>
+        </w:tabs>
+        <w:ind w:left="5040" w:hanging="360"/>
+      </w:pPr>
+    </w:lvl>
+    <w:lvl w:ilvl="7" w:tentative="1">
+      <w:start w:val="1"/>
+      <w:numFmt w:val="decimal"/>
+      <w:lvlText w:val="%8."/>
+      <w:lvlJc w:val="left"/>
+      <w:pPr>
+        <w:tabs>
+          <w:tab w:val="num" w:pos="5760"/>
+        </w:tabs>
+        <w:ind w:left="5760" w:hanging="360"/>
+      </w:pPr>
+    </w:lvl>
+    <w:lvl w:ilvl="8" w:tentative="1">
+      <w:start w:val="1"/>
+      <w:numFmt w:val="decimal"/>
+      <w:lvlText w:val="%9."/>
+      <w:lvlJc w:val="left"/>
+      <w:pPr>
+        <w:tabs>
+          <w:tab w:val="num" w:pos="6480"/>
+        </w:tabs>
+        <w:ind w:left="6480" w:hanging="360"/>
+      </w:pPr>
+    </w:lvl>
+  </w:abstractNum>
+  <w:abstractNum w:abstractNumId="7" w15:restartNumberingAfterBreak="0">
     <w:nsid w:val="555311E6"/>
     <w:multiLevelType w:val="hybridMultilevel"/>
     <w:tmpl w:val="C346FBD4"/>
@@ -2549,7 +3754,7 @@
       </w:rPr>
     </w:lvl>
   </w:abstractNum>
-  <w:abstractNum w:abstractNumId="7" w15:restartNumberingAfterBreak="0">
+  <w:abstractNum w:abstractNumId="8" w15:restartNumberingAfterBreak="0">
     <w:nsid w:val="60305741"/>
     <w:multiLevelType w:val="hybridMultilevel"/>
     <w:tmpl w:val="4252A964"/>
@@ -2662,7 +3867,123 @@
       </w:rPr>
     </w:lvl>
   </w:abstractNum>
-  <w:abstractNum w:abstractNumId="8" w15:restartNumberingAfterBreak="0">
+  <w:abstractNum w:abstractNumId="9" w15:restartNumberingAfterBreak="0">
+    <w:nsid w:val="6C431840"/>
+    <w:multiLevelType w:val="multilevel"/>
+    <w:tmpl w:val="5F68730E"/>
+    <w:lvl w:ilvl="0">
+      <w:start w:val="1"/>
+      <w:numFmt w:val="bullet"/>
+      <w:lvlText w:val=""/>
+      <w:lvlJc w:val="left"/>
+      <w:pPr>
+        <w:tabs>
+          <w:tab w:val="num" w:pos="720"/>
+        </w:tabs>
+        <w:ind w:left="720" w:hanging="360"/>
+      </w:pPr>
+      <w:rPr>
+        <w:rFonts w:ascii="Symbol" w:hAnsi="Symbol" w:hint="default"/>
+      </w:rPr>
+    </w:lvl>
+    <w:lvl w:ilvl="1" w:tentative="1">
+      <w:start w:val="1"/>
+      <w:numFmt w:val="decimal"/>
+      <w:lvlText w:val="%2."/>
+      <w:lvlJc w:val="left"/>
+      <w:pPr>
+        <w:tabs>
+          <w:tab w:val="num" w:pos="1440"/>
+        </w:tabs>
+        <w:ind w:left="1440" w:hanging="360"/>
+      </w:pPr>
+    </w:lvl>
+    <w:lvl w:ilvl="2" w:tentative="1">
+      <w:start w:val="1"/>
+      <w:numFmt w:val="decimal"/>
+      <w:lvlText w:val="%3."/>
+      <w:lvlJc w:val="left"/>
+      <w:pPr>
+        <w:tabs>
+          <w:tab w:val="num" w:pos="2160"/>
+        </w:tabs>
+        <w:ind w:left="2160" w:hanging="360"/>
+      </w:pPr>
+    </w:lvl>
+    <w:lvl w:ilvl="3" w:tentative="1">
+      <w:start w:val="1"/>
+      <w:numFmt w:val="decimal"/>
+      <w:lvlText w:val="%4."/>
+      <w:lvlJc w:val="left"/>
+      <w:pPr>
+        <w:tabs>
+          <w:tab w:val="num" w:pos="2880"/>
+        </w:tabs>
+        <w:ind w:left="2880" w:hanging="360"/>
+      </w:pPr>
+    </w:lvl>
+    <w:lvl w:ilvl="4" w:tentative="1">
+      <w:start w:val="1"/>
+      <w:numFmt w:val="decimal"/>
+      <w:lvlText w:val="%5."/>
+      <w:lvlJc w:val="left"/>
+      <w:pPr>
+        <w:tabs>
+          <w:tab w:val="num" w:pos="3600"/>
+        </w:tabs>
+        <w:ind w:left="3600" w:hanging="360"/>
+      </w:pPr>
+    </w:lvl>
+    <w:lvl w:ilvl="5" w:tentative="1">
+      <w:start w:val="1"/>
+      <w:numFmt w:val="decimal"/>
+      <w:lvlText w:val="%6."/>
+      <w:lvlJc w:val="left"/>
+      <w:pPr>
+        <w:tabs>
+          <w:tab w:val="num" w:pos="4320"/>
+        </w:tabs>
+        <w:ind w:left="4320" w:hanging="360"/>
+      </w:pPr>
+    </w:lvl>
+    <w:lvl w:ilvl="6" w:tentative="1">
+      <w:start w:val="1"/>
+      <w:numFmt w:val="decimal"/>
+      <w:lvlText w:val="%7."/>
+      <w:lvlJc w:val="left"/>
+      <w:pPr>
+        <w:tabs>
+          <w:tab w:val="num" w:pos="5040"/>
+        </w:tabs>
+        <w:ind w:left="5040" w:hanging="360"/>
+      </w:pPr>
+    </w:lvl>
+    <w:lvl w:ilvl="7" w:tentative="1">
+      <w:start w:val="1"/>
+      <w:numFmt w:val="decimal"/>
+      <w:lvlText w:val="%8."/>
+      <w:lvlJc w:val="left"/>
+      <w:pPr>
+        <w:tabs>
+          <w:tab w:val="num" w:pos="5760"/>
+        </w:tabs>
+        <w:ind w:left="5760" w:hanging="360"/>
+      </w:pPr>
+    </w:lvl>
+    <w:lvl w:ilvl="8" w:tentative="1">
+      <w:start w:val="1"/>
+      <w:numFmt w:val="decimal"/>
+      <w:lvlText w:val="%9."/>
+      <w:lvlJc w:val="left"/>
+      <w:pPr>
+        <w:tabs>
+          <w:tab w:val="num" w:pos="6480"/>
+        </w:tabs>
+        <w:ind w:left="6480" w:hanging="360"/>
+      </w:pPr>
+    </w:lvl>
+  </w:abstractNum>
+  <w:abstractNum w:abstractNumId="10" w15:restartNumberingAfterBreak="0">
     <w:nsid w:val="6D290E4A"/>
     <w:multiLevelType w:val="hybridMultilevel"/>
     <w:tmpl w:val="A614C070"/>
@@ -2775,7 +4096,7 @@
       </w:rPr>
     </w:lvl>
   </w:abstractNum>
-  <w:abstractNum w:abstractNumId="9" w15:restartNumberingAfterBreak="0">
+  <w:abstractNum w:abstractNumId="11" w15:restartNumberingAfterBreak="0">
     <w:nsid w:val="6E312800"/>
     <w:multiLevelType w:val="multilevel"/>
     <w:tmpl w:val="8F843F68"/>
@@ -2937,22 +4258,28 @@
     <w:abstractNumId w:val="5"/>
   </w:num>
   <w:num w:numId="5" w16cid:durableId="1899627057">
-    <w:abstractNumId w:val="9"/>
+    <w:abstractNumId w:val="11"/>
   </w:num>
   <w:num w:numId="6" w16cid:durableId="596668781">
     <w:abstractNumId w:val="4"/>
   </w:num>
   <w:num w:numId="7" w16cid:durableId="178393257">
-    <w:abstractNumId w:val="6"/>
+    <w:abstractNumId w:val="7"/>
   </w:num>
   <w:num w:numId="8" w16cid:durableId="1384327829">
-    <w:abstractNumId w:val="7"/>
+    <w:abstractNumId w:val="8"/>
   </w:num>
   <w:num w:numId="9" w16cid:durableId="1474835606">
     <w:abstractNumId w:val="1"/>
   </w:num>
   <w:num w:numId="10" w16cid:durableId="2121488779">
-    <w:abstractNumId w:val="8"/>
+    <w:abstractNumId w:val="10"/>
+  </w:num>
+  <w:num w:numId="11" w16cid:durableId="1507289340">
+    <w:abstractNumId w:val="6"/>
+  </w:num>
+  <w:num w:numId="12" w16cid:durableId="92409357">
+    <w:abstractNumId w:val="9"/>
   </w:num>
 </w:numbering>
 </file>

</xml_diff>